<commit_message>
Final recruiter-perspective audit: drift fixes, graceful LLM fallback, docs re-aligned
- LLM failures now auto-answer via the grounded built-in engine with a labeled
  warning (old copy dead-ended users at a removed Demo toggle)
- Stale 'sidebar' references fixed in needs-input card, chat caption, prompts
  README; dead engine_status removed
- Diagram: initial-analysis node + view/restore in the undo edge case (PNG
  re-rendered); PRD: version view/restore + 'restore to vN' assumption,
  re-verified exactly 1 page in Word
- Handoff video script re-timed to the current UI (AI instructions on Home,
  metrics under chat, version-history beat)
- Suites: 47 backend + 20 UI + 37 browser E2E + live API test, all passing

Co-Authored-By: Claude Fable 5 <noreply@anthropic.com>
</commit_message>
<xml_diff>
--- a/docs/PRD.docx
+++ b/docs/PRD.docx
@@ -266,7 +266,7 @@
         <w:t>MVP — Refinement loop:</w:t>
       </w:r>
       <w:r>
-        <w:t xml:space="preserve"> chat suggestions as cards (before/after diff, rationale, confidence, citations) · accept / modify / reject via buttons or typed reply · version history with undo (button or "undo" in chat).</w:t>
+        <w:t xml:space="preserve"> chat suggestions as cards (before/after diff, rationale, confidence, citations) · accept / modify / reject via buttons or typed reply · version history: view/restore any version, undo, and "what changed" diffs via chat.</w:t>
       </w:r>
     </w:p>
     <w:p>
@@ -474,7 +474,7 @@
         <w:t>Conversational patterns:</w:t>
       </w:r>
       <w:r>
-        <w:t xml:space="preserve"> analysts reference elements by number or name in plain English; one refinement intent per message; short imperatives ("undo", "accept") are deterministic commands, not LLM calls. </w:t>
+        <w:t xml:space="preserve"> analysts reference elements by number or name in plain English; one refinement intent per message; short imperatives ("undo", "accept", "restore to v2") are deterministic commands, not LLM calls. </w:t>
       </w:r>
       <w:r>
         <w:rPr>

</xml_diff>